<commit_message>
fixed service by mail docs
</commit_message>
<xml_diff>
--- a/docassemble/MODivorceForms/data/templates/service_by_mail_affidavit.docx
+++ b/docassemble/MODivorceForms/data/templates/service_by_mail_affidavit.docx
@@ -1075,7 +1075,7 @@
     </w:p>
     <w:p>
       <w:pPr>
-        <w:ind w:left="1440" w:firstLine="720"/>
+        <w:ind w:left="2160"/>
         <w:rPr>
           <w:rFonts w:ascii="Times New Roman" w:hAnsi="Times New Roman"/>
           <w:szCs w:val="24"/>
@@ -2905,6 +2905,19 @@
 </file>
 
 <file path=customXml/item1.xml><?xml version="1.0" encoding="utf-8"?>
+<p:properties xmlns:p="http://schemas.microsoft.com/office/2006/metadata/properties" xmlns:xsi="http://www.w3.org/2001/XMLSchema-instance" xmlns:pc="http://schemas.microsoft.com/office/infopath/2007/PartnerControls">
+  <documentManagement>
+    <_ip_UnifiedCompliancePolicyUIAction xmlns="http://schemas.microsoft.com/sharepoint/v3" xsi:nil="true"/>
+    <_ip_UnifiedCompliancePolicyProperties xmlns="http://schemas.microsoft.com/sharepoint/v3" xsi:nil="true"/>
+    <lcf76f155ced4ddcb4097134ff3c332f xmlns="877cd569-5afe-4c79-a79c-fefa2579d9de">
+      <Terms xmlns="http://schemas.microsoft.com/office/infopath/2007/PartnerControls"/>
+    </lcf76f155ced4ddcb4097134ff3c332f>
+    <TaxCatchAll xmlns="78e338ca-bdc9-4d5d-85ca-e5d51d206c55" xsi:nil="true"/>
+  </documentManagement>
+</p:properties>
+</file>
+
+<file path=customXml/item2.xml><?xml version="1.0" encoding="utf-8"?>
 <ct:contentTypeSchema xmlns:ct="http://schemas.microsoft.com/office/2006/metadata/contentType" xmlns:ma="http://schemas.microsoft.com/office/2006/metadata/properties/metaAttributes" ct:_="" ma:_="" ma:contentTypeName="Document" ma:contentTypeID="0x010100CE74CCE3EA761F4FB2ECE05E6740826C" ma:contentTypeVersion="22" ma:contentTypeDescription="Create a new document." ma:contentTypeScope="" ma:versionID="363bdbde3249c2d1c8187603616d51bf">
   <xsd:schema xmlns:xsd="http://www.w3.org/2001/XMLSchema" xmlns:xs="http://www.w3.org/2001/XMLSchema" xmlns:p="http://schemas.microsoft.com/office/2006/metadata/properties" xmlns:ns1="http://schemas.microsoft.com/sharepoint/v3" xmlns:ns2="877cd569-5afe-4c79-a79c-fefa2579d9de" xmlns:ns3="78e338ca-bdc9-4d5d-85ca-e5d51d206c55" targetNamespace="http://schemas.microsoft.com/office/2006/metadata/properties" ma:root="true" ma:fieldsID="ecc2c3765018bb73925974a56d08b4bc" ns1:_="" ns2:_="" ns3:_="">
     <xsd:import namespace="http://schemas.microsoft.com/sharepoint/v3"/>
@@ -3176,19 +3189,6 @@
 </ct:contentTypeSchema>
 </file>
 
-<file path=customXml/item2.xml><?xml version="1.0" encoding="utf-8"?>
-<p:properties xmlns:p="http://schemas.microsoft.com/office/2006/metadata/properties" xmlns:xsi="http://www.w3.org/2001/XMLSchema-instance" xmlns:pc="http://schemas.microsoft.com/office/infopath/2007/PartnerControls">
-  <documentManagement>
-    <_ip_UnifiedCompliancePolicyUIAction xmlns="http://schemas.microsoft.com/sharepoint/v3" xsi:nil="true"/>
-    <_ip_UnifiedCompliancePolicyProperties xmlns="http://schemas.microsoft.com/sharepoint/v3" xsi:nil="true"/>
-    <lcf76f155ced4ddcb4097134ff3c332f xmlns="877cd569-5afe-4c79-a79c-fefa2579d9de">
-      <Terms xmlns="http://schemas.microsoft.com/office/infopath/2007/PartnerControls"/>
-    </lcf76f155ced4ddcb4097134ff3c332f>
-    <TaxCatchAll xmlns="78e338ca-bdc9-4d5d-85ca-e5d51d206c55" xsi:nil="true"/>
-  </documentManagement>
-</p:properties>
-</file>
-
 <file path=customXml/item3.xml><?xml version="1.0" encoding="utf-8"?>
 <?mso-contentType ?>
 <FormTemplates xmlns="http://schemas.microsoft.com/sharepoint/v3/contenttype/forms">
@@ -3199,6 +3199,18 @@
 </file>
 
 <file path=customXml/itemProps1.xml><?xml version="1.0" encoding="utf-8"?>
+<ds:datastoreItem xmlns:ds="http://schemas.openxmlformats.org/officeDocument/2006/customXml" ds:itemID="{54B67E59-6134-4908-84F6-20413EA27AC6}">
+  <ds:schemaRefs>
+    <ds:schemaRef ds:uri="http://schemas.microsoft.com/office/2006/metadata/properties"/>
+    <ds:schemaRef ds:uri="http://schemas.microsoft.com/office/infopath/2007/PartnerControls"/>
+    <ds:schemaRef ds:uri="http://schemas.microsoft.com/sharepoint/v3"/>
+    <ds:schemaRef ds:uri="877cd569-5afe-4c79-a79c-fefa2579d9de"/>
+    <ds:schemaRef ds:uri="78e338ca-bdc9-4d5d-85ca-e5d51d206c55"/>
+  </ds:schemaRefs>
+</ds:datastoreItem>
+</file>
+
+<file path=customXml/itemProps2.xml><?xml version="1.0" encoding="utf-8"?>
 <ds:datastoreItem xmlns:ds="http://schemas.openxmlformats.org/officeDocument/2006/customXml" ds:itemID="{F1425CB0-54A4-4ADC-987F-DD271735F214}">
   <ds:schemaRefs>
     <ds:schemaRef ds:uri="http://schemas.microsoft.com/office/2006/metadata/contentType"/>
@@ -3218,18 +3230,6 @@
 </ds:datastoreItem>
 </file>
 
-<file path=customXml/itemProps2.xml><?xml version="1.0" encoding="utf-8"?>
-<ds:datastoreItem xmlns:ds="http://schemas.openxmlformats.org/officeDocument/2006/customXml" ds:itemID="{54B67E59-6134-4908-84F6-20413EA27AC6}">
-  <ds:schemaRefs>
-    <ds:schemaRef ds:uri="http://schemas.microsoft.com/office/2006/metadata/properties"/>
-    <ds:schemaRef ds:uri="http://schemas.microsoft.com/office/infopath/2007/PartnerControls"/>
-    <ds:schemaRef ds:uri="http://schemas.microsoft.com/sharepoint/v3"/>
-    <ds:schemaRef ds:uri="877cd569-5afe-4c79-a79c-fefa2579d9de"/>
-    <ds:schemaRef ds:uri="78e338ca-bdc9-4d5d-85ca-e5d51d206c55"/>
-  </ds:schemaRefs>
-</ds:datastoreItem>
-</file>
-
 <file path=customXml/itemProps3.xml><?xml version="1.0" encoding="utf-8"?>
 <ds:datastoreItem xmlns:ds="http://schemas.openxmlformats.org/officeDocument/2006/customXml" ds:itemID="{C5A770A2-574F-4AC0-B8F1-130DF3196D3B}">
   <ds:schemaRefs>

</xml_diff>